<commit_message>
feat(support): add donations drawer with payment methods, QR codes, and progress meter
Adds SupportUI (support.js) mounted into #drawer-support — Revolut/PayPal/crypto
payment methods with one-at-a-time QR toggles, a live Spendenstand progress bar
(donations.json), per-market Amazon buy buttons, and full de/en/ru i18n.
Also adds Pics photo gallery (PhotoSwipe), manuscript DOCX exports for all four
languages, and make_audio_zips.py helper script.
</commit_message>
<xml_diff>
--- a/locales/de/manuscript.docx
+++ b/locales/de/manuscript.docx
@@ -18,6 +18,337 @@
         <w:t xml:space="preserve">Anton Kopylow</w:t>
       </w:r>
     </w:p>
+    <w:p>
+      <w:pPr>
+        <w:jc w:val="center"/>
+        <w:spacing w:after="240"/>
+      </w:pPr>
+      <w:bookmarkStart w:id="900" w:name="toc"/>
+      <w:bookmarkEnd w:id="900"/>
+      <w:r>
+        <w:rPr>
+          <w:b/>
+          <w:sz w:val="36"/>
+        </w:rPr>
+        <w:t xml:space="preserve">Inhalt</w:t>
+      </w:r>
+    </w:p>
+    <w:p>
+      <w:pPr>
+        <w:pStyle w:val="TOC1"/>
+      </w:pPr>
+      <w:r>
+        <w:fldChar w:fldCharType="begin"/>
+      </w:r>
+      <w:r>
+        <w:instrText xml:space="preserve"> TOC \o "1-1" \h \z \n "1-1" </w:instrText>
+      </w:r>
+      <w:r>
+        <w:fldChar w:fldCharType="separate"/>
+      </w:r>
+      <w:hyperlink w:anchor="who-you-gonna-call" w:history="1">
+        <w:r>
+          <w:rPr>
+            <w:rStyle w:val="Hyperlink"/>
+          </w:rPr>
+          <w:t xml:space="preserve">Who you gonna call?</w:t>
+        </w:r>
+      </w:hyperlink>
+    </w:p>
+    <w:p>
+      <w:pPr>
+        <w:pStyle w:val="TOC1"/>
+      </w:pPr>
+      <w:hyperlink w:anchor="gehe-nicht-über-los" w:history="1">
+        <w:r>
+          <w:rPr>
+            <w:rStyle w:val="Hyperlink"/>
+          </w:rPr>
+          <w:t xml:space="preserve">Gehe nicht über Los</w:t>
+        </w:r>
+      </w:hyperlink>
+    </w:p>
+    <w:p>
+      <w:pPr>
+        <w:pStyle w:val="TOC1"/>
+      </w:pPr>
+      <w:hyperlink w:anchor="zwischen-raketen-und-rotem-sand" w:history="1">
+        <w:r>
+          <w:rPr>
+            <w:rStyle w:val="Hyperlink"/>
+          </w:rPr>
+          <w:t xml:space="preserve">Zwischen Raketen und rotem Sand</w:t>
+        </w:r>
+      </w:hyperlink>
+    </w:p>
+    <w:p>
+      <w:pPr>
+        <w:pStyle w:val="TOC1"/>
+      </w:pPr>
+      <w:hyperlink w:anchor="zwischen-den-welten" w:history="1">
+        <w:r>
+          <w:rPr>
+            <w:rStyle w:val="Hyperlink"/>
+          </w:rPr>
+          <w:t xml:space="preserve">Zwischen den Welten</w:t>
+        </w:r>
+      </w:hyperlink>
+    </w:p>
+    <w:p>
+      <w:pPr>
+        <w:pStyle w:val="TOC1"/>
+      </w:pPr>
+      <w:hyperlink w:anchor="im-vakuum-des-blackouts" w:history="1">
+        <w:r>
+          <w:rPr>
+            <w:rStyle w:val="Hyperlink"/>
+          </w:rPr>
+          <w:t xml:space="preserve">Im Vakuum des Blackouts</w:t>
+        </w:r>
+      </w:hyperlink>
+    </w:p>
+    <w:p>
+      <w:pPr>
+        <w:pStyle w:val="TOC1"/>
+      </w:pPr>
+      <w:hyperlink w:anchor="eisiger-stillstand" w:history="1">
+        <w:r>
+          <w:rPr>
+            <w:rStyle w:val="Hyperlink"/>
+          </w:rPr>
+          <w:t xml:space="preserve">Eisiger Stillstand</w:t>
+        </w:r>
+      </w:hyperlink>
+    </w:p>
+    <w:p>
+      <w:pPr>
+        <w:pStyle w:val="TOC1"/>
+      </w:pPr>
+      <w:hyperlink w:anchor="das-versiegelte-schicksal" w:history="1">
+        <w:r>
+          <w:rPr>
+            <w:rStyle w:val="Hyperlink"/>
+          </w:rPr>
+          <w:t xml:space="preserve">Das versiegelte Schicksal</w:t>
+        </w:r>
+      </w:hyperlink>
+    </w:p>
+    <w:p>
+      <w:pPr>
+        <w:pStyle w:val="TOC1"/>
+      </w:pPr>
+      <w:hyperlink w:anchor="der-16.000-dollar-panzer" w:history="1">
+        <w:r>
+          <w:rPr>
+            <w:rStyle w:val="Hyperlink"/>
+          </w:rPr>
+          <w:t xml:space="preserve">Der 16.000-Dollar-Panzer</w:t>
+        </w:r>
+      </w:hyperlink>
+    </w:p>
+    <w:p>
+      <w:pPr>
+        <w:pStyle w:val="TOC1"/>
+      </w:pPr>
+      <w:hyperlink w:anchor="no-problem-its-just-18.000" w:history="1">
+        <w:r>
+          <w:rPr>
+            <w:rStyle w:val="Hyperlink"/>
+          </w:rPr>
+          <w:t xml:space="preserve">No Problem, it’s just 18.000€</w:t>
+        </w:r>
+      </w:hyperlink>
+    </w:p>
+    <w:p>
+      <w:pPr>
+        <w:pStyle w:val="TOC1"/>
+      </w:pPr>
+      <w:hyperlink w:anchor="die-bittere-träne-der-freiheit" w:history="1">
+        <w:r>
+          <w:rPr>
+            <w:rStyle w:val="Hyperlink"/>
+          </w:rPr>
+          <w:t xml:space="preserve">Die bittere Träne der Freiheit</w:t>
+        </w:r>
+      </w:hyperlink>
+    </w:p>
+    <w:p>
+      <w:pPr>
+        <w:pStyle w:val="TOC1"/>
+      </w:pPr>
+      <w:hyperlink w:anchor="das-gesetz-der-schachtel" w:history="1">
+        <w:r>
+          <w:rPr>
+            <w:rStyle w:val="Hyperlink"/>
+          </w:rPr>
+          <w:t xml:space="preserve">Das Gesetz der Schachtel</w:t>
+        </w:r>
+      </w:hyperlink>
+    </w:p>
+    <w:p>
+      <w:pPr>
+        <w:pStyle w:val="TOC1"/>
+      </w:pPr>
+      <w:hyperlink w:anchor="zwischen-lammkoteletts-und-existenzangst" w:history="1">
+        <w:r>
+          <w:rPr>
+            <w:rStyle w:val="Hyperlink"/>
+          </w:rPr>
+          <w:t xml:space="preserve">Zwischen Lammkoteletts und Existenzangst</w:t>
+        </w:r>
+      </w:hyperlink>
+    </w:p>
+    <w:p>
+      <w:pPr>
+        <w:pStyle w:val="TOC1"/>
+      </w:pPr>
+      <w:hyperlink w:anchor="bürokratie-im-leerlauf" w:history="1">
+        <w:r>
+          <w:rPr>
+            <w:rStyle w:val="Hyperlink"/>
+          </w:rPr>
+          <w:t xml:space="preserve">Bürokratie im Leerlauf</w:t>
+        </w:r>
+      </w:hyperlink>
+    </w:p>
+    <w:p>
+      <w:pPr>
+        <w:pStyle w:val="TOC1"/>
+      </w:pPr>
+      <w:hyperlink w:anchor="ein-lichtblick-mit-hindernissen" w:history="1">
+        <w:r>
+          <w:rPr>
+            <w:rStyle w:val="Hyperlink"/>
+          </w:rPr>
+          <w:t xml:space="preserve">Ein Lichtblick mit Hindernissen</w:t>
+        </w:r>
+      </w:hyperlink>
+    </w:p>
+    <w:p>
+      <w:pPr>
+        <w:pStyle w:val="TOC1"/>
+      </w:pPr>
+      <w:hyperlink w:anchor="ein-anwalt-muss-her" w:history="1">
+        <w:r>
+          <w:rPr>
+            <w:rStyle w:val="Hyperlink"/>
+          </w:rPr>
+          <w:t xml:space="preserve">Ein Anwalt muss her</w:t>
+        </w:r>
+      </w:hyperlink>
+    </w:p>
+    <w:p>
+      <w:pPr>
+        <w:pStyle w:val="TOC1"/>
+      </w:pPr>
+      <w:hyperlink w:anchor="das-siegel-aus-tinte-und-tränen" w:history="1">
+        <w:r>
+          <w:rPr>
+            <w:rStyle w:val="Hyperlink"/>
+          </w:rPr>
+          <w:t xml:space="preserve">Das Siegel aus Tinte und Tränen</w:t>
+        </w:r>
+      </w:hyperlink>
+    </w:p>
+    <w:p>
+      <w:pPr>
+        <w:pStyle w:val="TOC1"/>
+      </w:pPr>
+      <w:hyperlink w:anchor="warten-warten" w:history="1">
+        <w:r>
+          <w:rPr>
+            <w:rStyle w:val="Hyperlink"/>
+          </w:rPr>
+          <w:t xml:space="preserve">Warten, warten</w:t>
+        </w:r>
+      </w:hyperlink>
+    </w:p>
+    <w:p>
+      <w:pPr>
+        <w:pStyle w:val="TOC1"/>
+      </w:pPr>
+      <w:hyperlink w:anchor="tag-des-gerichts" w:history="1">
+        <w:r>
+          <w:rPr>
+            <w:rStyle w:val="Hyperlink"/>
+          </w:rPr>
+          <w:t xml:space="preserve">Tag des Gerichts</w:t>
+        </w:r>
+      </w:hyperlink>
+    </w:p>
+    <w:p>
+      <w:pPr>
+        <w:pStyle w:val="TOC1"/>
+      </w:pPr>
+      <w:hyperlink w:anchor="in-khoy-um-khoy-und-um-khoy-herum" w:history="1">
+        <w:r>
+          <w:rPr>
+            <w:rStyle w:val="Hyperlink"/>
+          </w:rPr>
+          <w:t xml:space="preserve">In Khoy, um Khoy und um Khoy herum</w:t>
+        </w:r>
+      </w:hyperlink>
+    </w:p>
+    <w:p>
+      <w:pPr>
+        <w:pStyle w:val="TOC1"/>
+      </w:pPr>
+      <w:hyperlink w:anchor="brilles-hämisches-grinsen" w:history="1">
+        <w:r>
+          <w:rPr>
+            <w:rStyle w:val="Hyperlink"/>
+          </w:rPr>
+          <w:t xml:space="preserve">Brilles hämisches Grinsen</w:t>
+        </w:r>
+      </w:hyperlink>
+    </w:p>
+    <w:p>
+      <w:pPr>
+        <w:pStyle w:val="TOC1"/>
+      </w:pPr>
+      <w:hyperlink w:anchor="zwischen-notaren-lämmern-und-hummer" w:history="1">
+        <w:r>
+          <w:rPr>
+            <w:rStyle w:val="Hyperlink"/>
+          </w:rPr>
+          <w:t xml:space="preserve">Zwischen Notaren, Lämmern und Hummer</w:t>
+        </w:r>
+      </w:hyperlink>
+    </w:p>
+    <w:p>
+      <w:pPr>
+        <w:pStyle w:val="TOC1"/>
+      </w:pPr>
+      <w:hyperlink w:anchor="tourist-tourist" w:history="1">
+        <w:r>
+          <w:rPr>
+            <w:rStyle w:val="Hyperlink"/>
+          </w:rPr>
+          <w:t xml:space="preserve">Tourist, Tourist</w:t>
+        </w:r>
+      </w:hyperlink>
+    </w:p>
+    <w:p>
+      <w:pPr>
+        <w:pStyle w:val="TOC1"/>
+      </w:pPr>
+      <w:hyperlink w:anchor="epilog" w:history="1">
+        <w:r>
+          <w:rPr>
+            <w:rStyle w:val="Hyperlink"/>
+          </w:rPr>
+          <w:t xml:space="preserve">Epilog</w:t>
+        </w:r>
+      </w:hyperlink>
+      <w:r>
+        <w:fldChar w:fldCharType="end"/>
+      </w:r>
+    </w:p>
+    <w:p>
+      <w:r>
+        <w:br w:type="page"/>
+      </w:r>
+    </w:p>
     <w:bookmarkStart w:id="20" w:name="who-you-gonna-call"/>
     <w:p>
       <w:pPr>
@@ -98,501 +429,25 @@
         <w:t xml:space="preserve"> </w:t>
       </w:r>
       <w:r>
-        <w:t xml:space="preserve">„Anton“, sagt er schließlich schwerfällig, „sie werfen dir vor, dein Auto in den Iran geschmuggelt zu haben. Wir müssen in zwei Tagen wiederkommen. Mit einer Kaution von 48.000</w:t>
-      </w:r>
-      <w:r>
-        <w:t xml:space="preserve"> </w:t>
-      </w:r>
-      <m:oMath>
-        <m:r>
-          <m:rPr>
-            <m:sty m:val="p"/>
-          </m:rPr>
-          <m:t>.</m:t>
-        </m:r>
-        <m:r>
-          <m:t>W</m:t>
-        </m:r>
-        <m:r>
-          <m:t>e</m:t>
-        </m:r>
-        <m:r>
-          <m:t>n</m:t>
-        </m:r>
-        <m:r>
-          <m:t>n</m:t>
-        </m:r>
-        <m:r>
-          <m:t>w</m:t>
-        </m:r>
-        <m:r>
-          <m:t>i</m:t>
-        </m:r>
-        <m:r>
-          <m:t>r</m:t>
-        </m:r>
-        <m:r>
-          <m:t>d</m:t>
-        </m:r>
-        <m:r>
-          <m:t>a</m:t>
-        </m:r>
-        <m:r>
-          <m:t>s</m:t>
-        </m:r>
-        <m:r>
-          <m:t>G</m:t>
-        </m:r>
-        <m:r>
-          <m:t>e</m:t>
-        </m:r>
-        <m:r>
-          <m:t>l</m:t>
-        </m:r>
-        <m:r>
-          <m:t>d</m:t>
-        </m:r>
-        <m:r>
-          <m:t>n</m:t>
-        </m:r>
-        <m:r>
-          <m:t>i</m:t>
-        </m:r>
-        <m:r>
-          <m:t>c</m:t>
-        </m:r>
-        <m:r>
-          <m:t>h</m:t>
-        </m:r>
-        <m:r>
-          <m:t>t</m:t>
-        </m:r>
-        <m:r>
-          <m:t>h</m:t>
-        </m:r>
-        <m:r>
-          <m:t>a</m:t>
-        </m:r>
-        <m:r>
-          <m:t>b</m:t>
-        </m:r>
-        <m:r>
-          <m:t>e</m:t>
-        </m:r>
-        <m:r>
-          <m:t>n</m:t>
-        </m:r>
-        <m:r>
-          <m:rPr>
-            <m:sty m:val="p"/>
-          </m:rPr>
-          <m:t>,</m:t>
-        </m:r>
-        <m:r>
-          <m:t>g</m:t>
-        </m:r>
-        <m:r>
-          <m:t>e</m:t>
-        </m:r>
-        <m:r>
-          <m:t>h</m:t>
-        </m:r>
-        <m:r>
-          <m:t>s</m:t>
-        </m:r>
-        <m:r>
-          <m:t>t</m:t>
-        </m:r>
-        <m:r>
-          <m:t>d</m:t>
-        </m:r>
-        <m:r>
-          <m:t>u</m:t>
-        </m:r>
-        <m:r>
-          <m:t>i</m:t>
-        </m:r>
-        <m:r>
-          <m:t>n</m:t>
-        </m:r>
-        <m:r>
-          <m:t>s</m:t>
-        </m:r>
-        <m:r>
-          <m:t>G</m:t>
-        </m:r>
-        <m:r>
-          <m:t>e</m:t>
-        </m:r>
-        <m:r>
-          <m:t>f</m:t>
-        </m:r>
-        <m:r>
-          <m:t>ä</m:t>
-        </m:r>
-        <m:r>
-          <m:t>n</m:t>
-        </m:r>
-        <m:r>
-          <m:t>g</m:t>
-        </m:r>
-        <m:r>
-          <m:t>n</m:t>
-        </m:r>
-        <m:r>
-          <m:t>i</m:t>
-        </m:r>
-        <m:r>
-          <m:t>s</m:t>
-        </m:r>
-        <m:r>
-          <m:rPr>
-            <m:sty m:val="p"/>
-          </m:rPr>
-          <m:t>.</m:t>
-        </m:r>
-        <m:r>
-          <m:rPr>
-            <m:sty m:val="p"/>
-          </m:rPr>
-          <m:t>“</m:t>
-        </m:r>
-        <m:r>
-          <m:t>I</m:t>
-        </m:r>
-        <m:r>
-          <m:t>c</m:t>
-        </m:r>
-        <m:r>
-          <m:t>h</m:t>
-        </m:r>
-        <m:r>
-          <m:t>s</m:t>
-        </m:r>
-        <m:r>
-          <m:t>e</m:t>
-        </m:r>
-        <m:r>
-          <m:t>h</m:t>
-        </m:r>
-        <m:r>
-          <m:t>e</m:t>
-        </m:r>
-        <m:r>
-          <m:t>i</m:t>
-        </m:r>
-        <m:r>
-          <m:t>h</m:t>
-        </m:r>
-        <m:r>
-          <m:t>n</m:t>
-        </m:r>
-        <m:r>
-          <m:t>a</m:t>
-        </m:r>
-        <m:r>
-          <m:t>n</m:t>
-        </m:r>
-        <m:r>
-          <m:t>u</m:t>
-        </m:r>
-        <m:r>
-          <m:t>n</m:t>
-        </m:r>
-        <m:r>
-          <m:t>d</m:t>
-        </m:r>
-        <m:r>
-          <m:t>f</m:t>
-        </m:r>
-        <m:r>
-          <m:t>r</m:t>
-        </m:r>
-        <m:r>
-          <m:t>a</m:t>
-        </m:r>
-        <m:r>
-          <m:t>g</m:t>
-        </m:r>
-        <m:r>
-          <m:t>e</m:t>
-        </m:r>
-        <m:r>
-          <m:t>n</m:t>
-        </m:r>
-        <m:r>
-          <m:t>u</m:t>
-        </m:r>
-        <m:r>
-          <m:t>r</m:t>
-        </m:r>
-        <m:r>
-          <m:rPr>
-            <m:sty m:val="p"/>
-          </m:rPr>
-          <m:t>:</m:t>
-        </m:r>
-        <m:r>
-          <m:rPr>
-            <m:sty m:val="p"/>
-          </m:rPr>
-          <m:t>„</m:t>
-        </m:r>
-        <m:r>
-          <m:t>I</m:t>
-        </m:r>
-        <m:r>
-          <m:t>s</m:t>
-        </m:r>
-        <m:r>
-          <m:t>t</m:t>
-        </m:r>
-        <m:r>
-          <m:t>d</m:t>
-        </m:r>
-        <m:r>
-          <m:t>a</m:t>
-        </m:r>
-        <m:r>
-          <m:t>s</m:t>
-        </m:r>
-        <m:r>
-          <m:t>d</m:t>
-        </m:r>
-        <m:r>
-          <m:t>e</m:t>
-        </m:r>
-        <m:r>
-          <m:t>i</m:t>
-        </m:r>
-        <m:r>
-          <m:t>n</m:t>
-        </m:r>
-        <m:r>
-          <m:t>E</m:t>
-        </m:r>
-        <m:r>
-          <m:t>r</m:t>
-        </m:r>
-        <m:r>
-          <m:t>n</m:t>
-        </m:r>
-        <m:r>
-          <m:t>s</m:t>
-        </m:r>
-        <m:r>
-          <m:t>t</m:t>
-        </m:r>
-        <m:r>
-          <m:t>o</m:t>
-        </m:r>
-        <m:r>
-          <m:t>d</m:t>
-        </m:r>
-        <m:r>
-          <m:t>e</m:t>
-        </m:r>
-        <m:r>
-          <m:t>r</m:t>
-        </m:r>
-        <m:r>
-          <m:t>m</m:t>
-        </m:r>
-        <m:r>
-          <m:t>a</m:t>
-        </m:r>
-        <m:r>
-          <m:t>c</m:t>
-        </m:r>
-        <m:r>
-          <m:t>h</m:t>
-        </m:r>
-        <m:r>
-          <m:t>s</m:t>
-        </m:r>
-        <m:r>
-          <m:t>t</m:t>
-        </m:r>
-        <m:r>
-          <m:t>d</m:t>
-        </m:r>
-        <m:r>
-          <m:t>u</m:t>
-        </m:r>
-        <m:r>
-          <m:t>W</m:t>
-        </m:r>
-        <m:r>
-          <m:t>i</m:t>
-        </m:r>
-        <m:r>
-          <m:t>t</m:t>
-        </m:r>
-        <m:r>
-          <m:t>z</m:t>
-        </m:r>
-        <m:r>
-          <m:t>e</m:t>
-        </m:r>
-        <m:r>
-          <m:rPr>
-            <m:sty m:val="p"/>
-          </m:rPr>
-          <m:t>?</m:t>
-        </m:r>
-        <m:r>
-          <m:rPr>
-            <m:sty m:val="p"/>
-          </m:rPr>
-          <m:t>“</m:t>
-        </m:r>
-        <m:r>
-          <m:t>E</m:t>
-        </m:r>
-        <m:r>
-          <m:t>r</m:t>
-        </m:r>
-        <m:r>
-          <m:t>s</m:t>
-        </m:r>
-        <m:r>
-          <m:t>i</m:t>
-        </m:r>
-        <m:r>
-          <m:t>e</m:t>
-        </m:r>
-        <m:r>
-          <m:t>h</m:t>
-        </m:r>
-        <m:r>
-          <m:t>t</m:t>
-        </m:r>
-        <m:r>
-          <m:t>m</m:t>
-        </m:r>
-        <m:r>
-          <m:t>i</m:t>
-        </m:r>
-        <m:r>
-          <m:t>c</m:t>
-        </m:r>
-        <m:r>
-          <m:t>h</m:t>
-        </m:r>
-        <m:r>
-          <m:t>a</m:t>
-        </m:r>
-        <m:r>
-          <m:t>n</m:t>
-        </m:r>
-        <m:r>
-          <m:t>u</m:t>
-        </m:r>
-        <m:r>
-          <m:t>n</m:t>
-        </m:r>
-        <m:r>
-          <m:t>d</m:t>
-        </m:r>
-        <m:r>
-          <m:t>b</m:t>
-        </m:r>
-        <m:r>
-          <m:t>e</m:t>
-        </m:r>
-        <m:r>
-          <m:t>s</m:t>
-        </m:r>
-        <m:r>
-          <m:t>t</m:t>
-        </m:r>
-        <m:r>
-          <m:t>ä</m:t>
-        </m:r>
-        <m:r>
-          <m:t>t</m:t>
-        </m:r>
-        <m:r>
-          <m:t>i</m:t>
-        </m:r>
-        <m:r>
-          <m:t>g</m:t>
-        </m:r>
-        <m:r>
-          <m:t>t</m:t>
-        </m:r>
-        <m:r>
-          <m:rPr>
-            <m:sty m:val="p"/>
-          </m:rPr>
-          <m:t>,</m:t>
-        </m:r>
-        <m:r>
-          <m:t>d</m:t>
-        </m:r>
-        <m:r>
-          <m:t>a</m:t>
-        </m:r>
-        <m:r>
-          <m:t>s</m:t>
-        </m:r>
-        <m:r>
-          <m:t>s</m:t>
-        </m:r>
-        <m:r>
-          <m:t>d</m:t>
-        </m:r>
-        <m:r>
-          <m:t>a</m:t>
-        </m:r>
-        <m:r>
-          <m:t>s</m:t>
-        </m:r>
-        <m:r>
-          <m:t>k</m:t>
-        </m:r>
-        <m:r>
-          <m:t>e</m:t>
-        </m:r>
-        <m:r>
-          <m:t>i</m:t>
-        </m:r>
-        <m:r>
-          <m:t>n</m:t>
-        </m:r>
-        <m:r>
-          <m:t>W</m:t>
-        </m:r>
-        <m:r>
-          <m:t>i</m:t>
-        </m:r>
-        <m:r>
-          <m:t>t</m:t>
-        </m:r>
-        <m:r>
-          <m:t>z</m:t>
-        </m:r>
-        <m:r>
-          <m:t>i</m:t>
-        </m:r>
-        <m:r>
-          <m:t>s</m:t>
-        </m:r>
-        <m:r>
-          <m:t>t</m:t>
-        </m:r>
-        <m:r>
-          <m:rPr>
-            <m:sty m:val="p"/>
-          </m:rPr>
-          <m:t>.</m:t>
-        </m:r>
-        <m:r>
-          <m:t>48.000</m:t>
-        </m:r>
-      </m:oMath>
-      <w:r>
-        <w:t xml:space="preserve">. Eine Summe völlig jenseits meiner Realität. In meinem Kopf ploppt nur ein einziger, absurder Gedanke auf: Gehe nicht über Los. Ziehe keine 4000$ ein.</w:t>
+        <w:t xml:space="preserve">„Anton“, sagt er schließlich schwerfällig, „sie werfen dir vor, dein Auto in den Iran geschmuggelt zu haben. Wir müssen in zwei Tagen wiederkommen. Mit einer Kaution von 48.000 $. Wenn wir das Geld nicht haben, gehst du ins Gefängnis.“</w:t>
+      </w:r>
+      <w:r>
+        <w:t xml:space="preserve"> </w:t>
+      </w:r>
+      <w:r>
+        <w:t xml:space="preserve">Ich sehe ihn an und frage nur: „Ist das dein Ernst oder machst du Witze?“</w:t>
+      </w:r>
+      <w:r>
+        <w:t xml:space="preserve"> </w:t>
+      </w:r>
+      <w:r>
+        <w:t xml:space="preserve">Er sieht mich an und bestätigt, dass das kein Witz ist.</w:t>
+      </w:r>
+      <w:r>
+        <w:t xml:space="preserve"> </w:t>
+      </w:r>
+      <w:r>
+        <w:t xml:space="preserve">48.000$. Eine Summe völlig jenseits meiner Realität. In meinem Kopf ploppt nur ein einziger, absurder Gedanke auf: Gehe nicht über Los. Ziehe keine 4000$ ein.</w:t>
       </w:r>
       <w:r>
         <w:t xml:space="preserve"> </w:t>
@@ -997,135 +852,7 @@
         <w:t xml:space="preserve"> </w:t>
       </w:r>
       <w:r>
-        <w:t xml:space="preserve">Ihr wisst sicher, was jetzt kommt. Zahlen Sie 48.000</w:t>
-      </w:r>
-      <w:r>
-        <w:t xml:space="preserve"> </w:t>
-      </w:r>
-      <m:oMath>
-        <m:r>
-          <m:rPr>
-            <m:sty m:val="p"/>
-          </m:rPr>
-          <m:t>.</m:t>
-        </m:r>
-        <m:r>
-          <m:t>G</m:t>
-        </m:r>
-        <m:r>
-          <m:t>e</m:t>
-        </m:r>
-        <m:r>
-          <m:t>h</m:t>
-        </m:r>
-        <m:r>
-          <m:t>e</m:t>
-        </m:r>
-        <m:r>
-          <m:t>n</m:t>
-        </m:r>
-        <m:r>
-          <m:t>S</m:t>
-        </m:r>
-        <m:r>
-          <m:t>i</m:t>
-        </m:r>
-        <m:r>
-          <m:t>e</m:t>
-        </m:r>
-        <m:r>
-          <m:t>n</m:t>
-        </m:r>
-        <m:r>
-          <m:t>i</m:t>
-        </m:r>
-        <m:r>
-          <m:t>c</m:t>
-        </m:r>
-        <m:r>
-          <m:t>h</m:t>
-        </m:r>
-        <m:r>
-          <m:t>t</m:t>
-        </m:r>
-        <m:r>
-          <m:t>ü</m:t>
-        </m:r>
-        <m:r>
-          <m:t>b</m:t>
-        </m:r>
-        <m:r>
-          <m:t>e</m:t>
-        </m:r>
-        <m:r>
-          <m:t>r</m:t>
-        </m:r>
-        <m:r>
-          <m:t>L</m:t>
-        </m:r>
-        <m:r>
-          <m:t>o</m:t>
-        </m:r>
-        <m:r>
-          <m:t>s</m:t>
-        </m:r>
-        <m:r>
-          <m:rPr>
-            <m:sty m:val="p"/>
-          </m:rPr>
-          <m:t>.</m:t>
-        </m:r>
-        <m:r>
-          <m:t>Z</m:t>
-        </m:r>
-        <m:r>
-          <m:t>i</m:t>
-        </m:r>
-        <m:r>
-          <m:t>e</m:t>
-        </m:r>
-        <m:r>
-          <m:t>h</m:t>
-        </m:r>
-        <m:r>
-          <m:t>e</m:t>
-        </m:r>
-        <m:r>
-          <m:t>n</m:t>
-        </m:r>
-        <m:r>
-          <m:t>S</m:t>
-        </m:r>
-        <m:r>
-          <m:t>i</m:t>
-        </m:r>
-        <m:r>
-          <m:t>e</m:t>
-        </m:r>
-        <m:r>
-          <m:t>k</m:t>
-        </m:r>
-        <m:r>
-          <m:t>e</m:t>
-        </m:r>
-        <m:r>
-          <m:t>i</m:t>
-        </m:r>
-        <m:r>
-          <m:t>n</m:t>
-        </m:r>
-        <m:r>
-          <m:t>e</m:t>
-        </m:r>
-        <m:r>
-          <m:t>4.000</m:t>
-        </m:r>
-      </m:oMath>
-      <w:r>
-        <w:t xml:space="preserve"> </w:t>
-      </w:r>
-      <w:r>
-        <w:t xml:space="preserve">ein. Hier wurde die Bedeutung des zuvor gewählten Autowertes von 16.000$ schlagartig klar. Es ist im Iran gängige Praxis, die Strafe in einem Schmuggelfall auf das Dreifache des Warenwertes festzusetzen, weshalb auch die Sicherheitsleistung dieser Summe entsprach.</w:t>
+        <w:t xml:space="preserve">Ihr wisst sicher, was jetzt kommt. Zahlen Sie 48.000 $. Gehen Sie nicht über Los. Ziehen Sie keine 4.000$ ein. Hier wurde die Bedeutung des zuvor gewählten Autowertes von 16.000$ schlagartig klar. Es ist im Iran gängige Praxis, die Strafe in einem Schmuggelfall auf das Dreifache des Warenwertes festzusetzen, weshalb auch die Sicherheitsleistung dieser Summe entsprach.</w:t>
       </w:r>
       <w:r>
         <w:t xml:space="preserve"> </w:t>
@@ -2250,7 +1977,7 @@
         <w:rFonts w:asciiTheme="minorHAnsi" w:cstheme="minorBidi" w:eastAsiaTheme="minorHAnsi" w:hAnsiTheme="minorHAnsi"/>
         <w:sz w:val="24"/>
         <w:szCs w:val="24"/>
-        <w:lang w:bidi="ar-SA" w:eastAsia="en-US" w:val="de"/>
+        <w:lang w:bidi="ar-SA" w:eastAsia="en-US" w:val="en-US"/>
       </w:rPr>
     </w:rPrDefault>
     <w:pPrDefault>
@@ -3134,6 +2861,13 @@
     <w:name w:val="NormalTok"/>
     <w:basedOn w:val="VerbatimChar"/>
     <w:rPr/>
+  </w:style>
+  <w:style w:type="paragraph" w:styleId="TOC1">
+    <w:name w:val="toc 1"/>
+    <w:basedOn w:val="Normal"/>
+    <w:pPr>
+      <w:spacing w:after="120"/>
+    </w:pPr>
   </w:style>
 </w:styles>
 </file>

</xml_diff>